<commit_message>
fix(appli-ia): corrige la leçon 08 et durcit le prompt — frontière Vite testée dans les deux sens, db.prepare, observation impossible, PROJET.md restauré ; étape 5 bis (e) observations datées, (f) comportements testés ; étape 6 refuse un PROJET.md élagué
Co-Authored-By: Claude Opus 5 <noreply@anthropic.com>
</commit_message>
<xml_diff>
--- a/livrables/lecons/2026-09-18_lecon-appli-ia_08_api-architecture-contrats.docx
+++ b/livrables/lecons/2026-09-18_lecon-appli-ia_08_api-architecture-contrats.docx
@@ -899,7 +899,17 @@
           <w:sz w:val="22"/>
           <w:szCs w:val="22"/>
         </w:rPr>
-        <w:t xml:space="preserve">Trois fichiers sont en place : scripts/utils.js (nouveau), scripts/serveur.js et scripts/indexer.js (mis à jour), src/types.ts (réconcilié). Le job les a déposés avant que tu ouvres cette leçon. Tu ne crées rien : tu lis, tu modifies, tu observes.</w:t>
+        <w:t xml:space="preserve">Quatre fichiers sont en place : scripts/utils.js (nouveau), scripts/serveur.js et scripts/indexer.js (mis à jour), src/types.ts (réconcilié). Le job les a déposés avant que tu ouvres cette leçon. Tu ne crées rien : tu lis, tu modifies, tu observes. </w:t>
+      </w:r>
+      <w:r>
+        <w:rPr>
+          <w:i/>
+          <w:iCs/>
+          <w:color w:val="6B7280"/>
+          <w:sz w:val="20"/>
+          <w:szCs w:val="20"/>
+        </w:rPr>
+        <w:t xml:space="preserve">[Corrigé le 18/09/2026 : l'amorce annonçait « trois » fichiers et en nommait quatre.]</w:t>
       </w:r>
     </w:p>
     <w:p>
@@ -941,7 +951,7 @@
           <w:sz w:val="22"/>
           <w:szCs w:val="22"/>
         </w:rPr>
-        <w:t xml:space="preserve">Ouvre scripts/utils.js. Ce fichier contient tout ce qui était dupliqué entre serveur.js et indexer.js. Repas les trois sections :</w:t>
+        <w:t xml:space="preserve">Ouvre scripts/utils.js. Ce fichier contient tout ce qui était dupliqué entre serveur.js et indexer.js. Repère les trois sections :</w:t>
       </w:r>
     </w:p>
     <w:p>
@@ -1389,7 +1399,7 @@
           <w:sz w:val="20"/>
           <w:szCs w:val="20"/>
         </w:rPr>
-        <w:t xml:space="preserve">const { RACINE, CATEGORIES, DOCS_DE_DOSSIER,</w:t>
+        <w:t xml:space="preserve">const { CATEGORIES, DOCS_DE_DOSSIER,</w:t>
       </w:r>
     </w:p>
     <w:p>
@@ -1417,11 +1427,13 @@
       </w:pPr>
       <w:r>
         <w:rPr>
-          <w:color w:val="1F2937"/>
-          <w:sz w:val="22"/>
-          <w:szCs w:val="22"/>
-        </w:rPr>
-        <w:t xml:space="preserve"/>
+          <w:i/>
+          <w:iCs/>
+          <w:color w:val="6B7280"/>
+          <w:sz w:val="20"/>
+          <w:szCs w:val="20"/>
+        </w:rPr>
+        <w:t xml:space="preserve">[Corrigé le 18/09/2026 : l'extrait importait RACINE, que scripts/serveur.js n'importe pas — il est aligné sur le fichier réel (ligne 24).]</w:t>
       </w:r>
     </w:p>
     <w:p>
@@ -1669,7 +1681,17 @@
           <w:sz w:val="22"/>
           <w:szCs w:val="22"/>
         </w:rPr>
-        <w:t xml:space="preserve">Lesquels resteront à NULL ? (indice : regarde les noms qui ne contiennent pas YYYY-MM-DD)</w:t>
+        <w:t xml:space="preserve">Lesquels resteront à NULL ? (indice : regarde les noms qui ne contiennent pas YYYY-MM-DD — et un nom à double extension) </w:t>
+      </w:r>
+      <w:r>
+        <w:rPr>
+          <w:i/>
+          <w:iCs/>
+          <w:color w:val="6B7280"/>
+          <w:sz w:val="20"/>
+          <w:szCs w:val="20"/>
+        </w:rPr>
+        <w:t xml:space="preserve">[Corrigé le 18/09/2026 : l'indice disait seulement « qui ne contiennent pas YYYY-MM-DD » ; un des 14 restants porte une date.]</w:t>
       </w:r>
     </w:p>
     <w:p>
@@ -2034,6 +2056,80 @@
           <w:szCs w:val="22"/>
         </w:rPr>
         <w:t xml:space="preserve">   "Quiz Autodetermination.pptx" restent à NULL, c’est correct).</w:t>
+      </w:r>
+    </w:p>
+    <w:p>
+      <w:pPr>
+        <w:pBdr>
+          <w:left w:val="thick" w:color="D97706" w:sz="12"/>
+        </w:pBdr>
+        <w:shd w:fill="FFF4E5" w:val="clear"/>
+        <w:spacing w:after="40" w:before="40" w:line="276" w:lineRule="auto"/>
+        <w:ind w:left="360"/>
+      </w:pPr>
+      <w:r>
+        <w:rPr>
+          <w:color w:val="1F2937"/>
+          <w:sz w:val="22"/>
+          <w:szCs w:val="22"/>
+        </w:rPr>
+        <w:t xml:space="preserve">   Mesuré le 18/09/2026 : 14 lignes restent à NULL sur 548 (2 quiz, 3 infographies, 7 veilles, 2 documents),</w:t>
+      </w:r>
+    </w:p>
+    <w:p>
+      <w:pPr>
+        <w:pBdr>
+          <w:left w:val="thick" w:color="D97706" w:sz="12"/>
+        </w:pBdr>
+        <w:shd w:fill="FFF4E5" w:val="clear"/>
+        <w:spacing w:after="40" w:before="40" w:line="276" w:lineRule="auto"/>
+        <w:ind w:left="360"/>
+      </w:pPr>
+      <w:r>
+        <w:rPr>
+          <w:color w:val="1F2937"/>
+          <w:sz w:val="22"/>
+          <w:szCs w:val="22"/>
+        </w:rPr>
+        <w:t xml:space="preserve">   dont UNE porte une date : veille-essms-2026-05-20-2026-05-26.fiche.md — path.parse().name garde</w:t>
+      </w:r>
+    </w:p>
+    <w:p>
+      <w:pPr>
+        <w:pBdr>
+          <w:left w:val="thick" w:color="D97706" w:sz="12"/>
+        </w:pBdr>
+        <w:shd w:fill="FFF4E5" w:val="clear"/>
+        <w:spacing w:after="40" w:before="40" w:line="276" w:lineRule="auto"/>
+        <w:ind w:left="360"/>
+      </w:pPr>
+      <w:r>
+        <w:rPr>
+          <w:color w:val="1F2937"/>
+          <w:sz w:val="22"/>
+          <w:szCs w:val="22"/>
+        </w:rPr>
+        <w:t xml:space="preserve">   « .fiche » devant l'ancre $, la convention 2 ne la voit pas. Ce n'est pas un bug du correctif, c'est sa limite.</w:t>
+      </w:r>
+    </w:p>
+    <w:p>
+      <w:pPr>
+        <w:pBdr>
+          <w:left w:val="thick" w:color="D97706" w:sz="12"/>
+        </w:pBdr>
+        <w:shd w:fill="FFF4E5" w:val="clear"/>
+        <w:spacing w:after="40" w:before="40" w:line="276" w:lineRule="auto"/>
+        <w:ind w:left="360"/>
+      </w:pPr>
+      <w:r>
+        <w:rPr>
+          <w:i/>
+          <w:iCs/>
+          <w:color w:val="6B7280"/>
+          <w:sz w:val="20"/>
+          <w:szCs w:val="20"/>
+        </w:rPr>
+        <w:t xml:space="preserve">   [Corrigé le 18/09/2026 : la note disait que les restants n'avaient « aucune date », sans avoir listé les 14.]</w:t>
       </w:r>
     </w:p>
     <w:p>
@@ -2227,7 +2323,34 @@
           <w:sz w:val="22"/>
           <w:szCs w:val="22"/>
         </w:rPr>
-        <w:t xml:space="preserve">La requête 2 (« les 5 livrables les plus récents ») filtre WHERE date IS NOT NULL : vérifie que des quiz récents y apparaissent maintenant.</w:t>
+        <w:t xml:space="preserve">La requête 2 (« les 5 livrables les plus récents ») filtre WHERE date IS NOT NULL : elle travaille désormais sur les quiz aussi — mais tu n'en verras AUCUN. Mesuré le 18/09/2026 : ses cinq lignes sont des leçons des 17 et 18 septembre, et le quiz le plus récent de la base date du 27/06/2026. Pour observer la propriété, restreins la requête à la catégorie : </w:t>
+      </w:r>
+      <w:r>
+        <w:rPr>
+          <w:rFonts w:ascii="Consolas" w:cs="Consolas" w:eastAsia="Consolas" w:hAnsi="Consolas"/>
+          <w:color w:val="1F2937"/>
+          <w:sz w:val="20"/>
+          <w:szCs w:val="20"/>
+        </w:rPr>
+        <w:t xml:space="preserve">SELECT nom, date FROM livrables WHERE categorie = 'quiz' ORDER BY date DESC LIMIT 5</w:t>
+      </w:r>
+      <w:r>
+        <w:rPr>
+          <w:color w:val="1F2937"/>
+          <w:sz w:val="22"/>
+          <w:szCs w:val="22"/>
+        </w:rPr>
+        <w:t xml:space="preserve"> — cinq quiz datés (sortie du 18/09/2026 : 2026-06-27, 2026-06-22, 2026-06-15, 2026-06-06, 2026-05-24). </w:t>
+      </w:r>
+      <w:r>
+        <w:rPr>
+          <w:i/>
+          <w:iCs/>
+          <w:color w:val="6B7280"/>
+          <w:sz w:val="20"/>
+          <w:szCs w:val="20"/>
+        </w:rPr>
+        <w:t xml:space="preserve">[Corrigé le 18/09/2026 : la consigne demandait de « vérifier que des quiz récents y apparaissent maintenant », ce qui ne peut pas se produire tant que les leçons quotidiennes sont plus récentes que le dernier quiz.]</w:t>
       </w:r>
     </w:p>
     <w:p>
@@ -2537,7 +2660,17 @@
           <w:sz w:val="22"/>
           <w:szCs w:val="22"/>
         </w:rPr>
-        <w:t xml:space="preserve">Tu dois voir les quiz et infographies retomber à NULL dans la requête 3. C’est la régression — exactement ce qui se passait avant cette leçon.</w:t>
+        <w:t xml:space="preserve">Tu dois voir les quiz et infographies retomber à NULL dans la requête 3. C’est la régression — exactement ce qui se passait avant cette leçon. </w:t>
+      </w:r>
+      <w:r>
+        <w:rPr>
+          <w:i/>
+          <w:iCs/>
+          <w:color w:val="6B7280"/>
+          <w:sz w:val="20"/>
+          <w:szCs w:val="20"/>
+        </w:rPr>
+        <w:t xml:space="preserve">(Mesuré le 18/09/2026 en rejouant le sabotage : 66 lignes à NULL, dont 45 quiz et infographies « rbpp » — le chiffre d'avant la leçon.)</w:t>
       </w:r>
     </w:p>
     <w:p>
@@ -2563,7 +2696,17 @@
           <w:sz w:val="22"/>
           <w:szCs w:val="22"/>
         </w:rPr>
-        <w:t xml:space="preserve">Répare : restaure les deux lignes commentées, réindexe, vérifie que les dates réapparaissent. Tu viens de simuler le cycle complet d’un bug de régression : introduire, constater, corriger, vérifier.</w:t>
+        <w:t xml:space="preserve">Répare : restaure les deux lignes commentées, réindexe, vérifie que les dates réapparaissent. Tu viens de simuler le cycle complet d’un bug de régression : introduire, constater, corriger, vérifier. </w:t>
+      </w:r>
+      <w:r>
+        <w:rPr>
+          <w:i/>
+          <w:iCs/>
+          <w:color w:val="6B7280"/>
+          <w:sz w:val="20"/>
+          <w:szCs w:val="20"/>
+        </w:rPr>
+        <w:t xml:space="preserve">(Mesuré le 18/09/2026 après restauration : 14 lignes à NULL, 548 fichiers.)</w:t>
       </w:r>
     </w:p>
     <w:p>
@@ -3059,7 +3202,7 @@
           <w:sz w:val="22"/>
           <w:szCs w:val="22"/>
         </w:rPr>
-        <w:t xml:space="preserve">   de modules différents. Un import relatif "../../src/types.ts" depuis le frontend franchirait</w:t>
+        <w:t xml:space="preserve">   de modules différents. Mais ce n'est PAS une frontière technique — testé le 18/09/2026 :</w:t>
       </w:r>
     </w:p>
     <w:p>
@@ -3077,7 +3220,7 @@
           <w:sz w:val="22"/>
           <w:szCs w:val="22"/>
         </w:rPr>
-        <w:t xml:space="preserve">   une frontière que Vite ne résout pas à la compilation.</w:t>
+        <w:t xml:space="preserve">   un « import type { Livrable } from '../../src/types' » ajouté dans frontend/src/ et importé</w:t>
       </w:r>
     </w:p>
     <w:p>
@@ -3095,7 +3238,7 @@
           <w:sz w:val="22"/>
           <w:szCs w:val="22"/>
         </w:rPr>
-        <w:t xml:space="preserve">   Solution propre pour un projet plus grand : un dossier "shared/" avec son propre package.json</w:t>
+        <w:t xml:space="preserve">   depuis main.tsx passe « npx tsc --noEmit » (exit 0) et « vite build » (✓ built). Seul le</w:t>
       </w:r>
     </w:p>
     <w:p>
@@ -3113,7 +3256,117 @@
           <w:sz w:val="22"/>
           <w:szCs w:val="22"/>
         </w:rPr>
-        <w:t xml:space="preserve">   (monorepo). Pour ce projet, tenir les deux en sync reste lisible et suffisant.</w:t>
+        <w:t xml:space="preserve">   serveur de développement refuse de SERVIR un fichier hors de server.fs.allow (403 sur</w:t>
+      </w:r>
+    </w:p>
+    <w:p>
+      <w:pPr>
+        <w:pBdr>
+          <w:left w:val="thick" w:color="D97706" w:sz="12"/>
+        </w:pBdr>
+        <w:shd w:fill="FFF4E5" w:val="clear"/>
+        <w:spacing w:after="40" w:before="40" w:line="276" w:lineRule="auto"/>
+        <w:ind w:left="360"/>
+      </w:pPr>
+      <w:r>
+        <w:rPr>
+          <w:color w:val="1F2937"/>
+          <w:sz w:val="22"/>
+          <w:szCs w:val="22"/>
+        </w:rPr>
+        <w:t xml:space="preserve">   /@fs/…/src/types.ts) — et un import de type ne provoque jamais cette requête :</w:t>
+      </w:r>
+    </w:p>
+    <w:p>
+      <w:pPr>
+        <w:pBdr>
+          <w:left w:val="thick" w:color="D97706" w:sz="12"/>
+        </w:pBdr>
+        <w:shd w:fill="FFF4E5" w:val="clear"/>
+        <w:spacing w:after="40" w:before="40" w:line="276" w:lineRule="auto"/>
+        <w:ind w:left="360"/>
+      </w:pPr>
+      <w:r>
+        <w:rPr>
+          <w:color w:val="1F2937"/>
+          <w:sz w:val="22"/>
+          <w:szCs w:val="22"/>
+        </w:rPr>
+        <w:t xml:space="preserve">   verbatimModuleSyntax l'efface avant que Vite le voie. Tenir deux fichiers est donc un CHOIX,</w:t>
+      </w:r>
+    </w:p>
+    <w:p>
+      <w:pPr>
+        <w:pBdr>
+          <w:left w:val="thick" w:color="D97706" w:sz="12"/>
+        </w:pBdr>
+        <w:shd w:fill="FFF4E5" w:val="clear"/>
+        <w:spacing w:after="40" w:before="40" w:line="276" w:lineRule="auto"/>
+        <w:ind w:left="360"/>
+      </w:pPr>
+      <w:r>
+        <w:rPr>
+          <w:color w:val="1F2937"/>
+          <w:sz w:val="22"/>
+          <w:szCs w:val="22"/>
+        </w:rPr>
+        <w:t xml:space="preserve">   pas une contrainte : une ligne server.fs.allow lèverait la limite en dev, et un dossier</w:t>
+      </w:r>
+    </w:p>
+    <w:p>
+      <w:pPr>
+        <w:pBdr>
+          <w:left w:val="thick" w:color="D97706" w:sz="12"/>
+        </w:pBdr>
+        <w:shd w:fill="FFF4E5" w:val="clear"/>
+        <w:spacing w:after="40" w:before="40" w:line="276" w:lineRule="auto"/>
+        <w:ind w:left="360"/>
+      </w:pPr>
+      <w:r>
+        <w:rPr>
+          <w:color w:val="1F2937"/>
+          <w:sz w:val="22"/>
+          <w:szCs w:val="22"/>
+        </w:rPr>
+        <w:t xml:space="preserve">   « shared/ » avec son propre package.json (monorepo) est la solution d'un projet plus grand.</w:t>
+      </w:r>
+    </w:p>
+    <w:p>
+      <w:pPr>
+        <w:pBdr>
+          <w:left w:val="thick" w:color="D97706" w:sz="12"/>
+        </w:pBdr>
+        <w:shd w:fill="FFF4E5" w:val="clear"/>
+        <w:spacing w:after="40" w:before="40" w:line="276" w:lineRule="auto"/>
+        <w:ind w:left="360"/>
+      </w:pPr>
+      <w:r>
+        <w:rPr>
+          <w:color w:val="1F2937"/>
+          <w:sz w:val="22"/>
+          <w:szCs w:val="22"/>
+        </w:rPr>
+        <w:t xml:space="preserve">   Pour ce projet, tenir les deux en sync reste lisible et suffisant — c'est la raison, pas Vite.</w:t>
+      </w:r>
+    </w:p>
+    <w:p>
+      <w:pPr>
+        <w:pBdr>
+          <w:left w:val="thick" w:color="D97706" w:sz="12"/>
+        </w:pBdr>
+        <w:shd w:fill="FFF4E5" w:val="clear"/>
+        <w:spacing w:after="40" w:before="40" w:line="276" w:lineRule="auto"/>
+        <w:ind w:left="360"/>
+      </w:pPr>
+      <w:r>
+        <w:rPr>
+          <w:i/>
+          <w:iCs/>
+          <w:color w:val="6B7280"/>
+          <w:sz w:val="20"/>
+          <w:szCs w:val="20"/>
+        </w:rPr>
+        <w:t xml:space="preserve">   [Corrigé le 18/09/2026 : l'encadré affirmait qu'un tel import « franchirait une frontière que Vite ne résout pas à la compilation » — faux dans les deux sens, et non testé.]</w:t>
       </w:r>
     </w:p>
     <w:p>
@@ -3830,7 +4083,7 @@
                 <w:sz w:val="20"/>
                 <w:szCs w:val="20"/>
               </w:rPr>
-              <w:t xml:space="preserve">better-sqlite3 attend un string SQL, pas plusieurs arguments</w:t>
+              <w:t xml:space="preserve">prepare() est appelé sur le MODULE, pas sur une instance : require('better-sqlite3') sans l'appel ('portail.db') qui doit suivre. Reproduit le 18/09/2026 : sans l'appel, le message est exactement celui-ci ; avec deux arguments, prepare() ne lève rien.</w:t>
             </w:r>
           </w:p>
         </w:tc>
@@ -3851,7 +4104,17 @@
                 <w:sz w:val="20"/>
                 <w:szCs w:val="20"/>
               </w:rPr>
-              <w:t xml:space="preserve">Le .prepare() prend UN seul string. La concaténation doit être faite avant l’appel.</w:t>
+              <w:t xml:space="preserve">Écris const db = require('better-sqlite3')('portail.db') — la fabrique, puis l'instance. La concaténation du SQL à l'intérieur de l'appel (exercice 2) fonctionne. </w:t>
+            </w:r>
+            <w:r>
+              <w:rPr>
+                <w:i/>
+                <w:iCs/>
+                <w:color w:val="6B7280"/>
+                <w:sz w:val="20"/>
+                <w:szCs w:val="20"/>
+              </w:rPr>
+              <w:t xml:space="preserve">[Corrigé le 18/09/2026 : la cause donnée était « plusieurs arguments » et le remède « concaténer avant l'appel » — ni l'une ni l'autre ne correspond au message.]</w:t>
             </w:r>
           </w:p>
         </w:tc>
@@ -4661,6 +4924,161 @@
           <w:szCs w:val="22"/>
         </w:rPr>
         <w:t xml:space="preserve">La différence entre un test qui passe et un test qui prouve</w:t>
+      </w:r>
+    </w:p>
+    <w:p>
+      <w:pPr>
+        <w:pStyle w:val="Heading2"/>
+        <w:spacing w:after="120" w:before="280"/>
+      </w:pPr>
+      <w:r>
+        <w:rPr>
+          <w:b/>
+          <w:bCs/>
+          <w:color w:val="1B3A6B"/>
+          <w:sz w:val="30"/>
+          <w:szCs w:val="30"/>
+        </w:rPr>
+        <w:t xml:space="preserve">📝 Journal des corrections (18/09/2026)</w:t>
+      </w:r>
+    </w:p>
+    <w:p>
+      <w:pPr>
+        <w:spacing w:after="80" w:before="80" w:line="276" w:lineRule="auto"/>
+      </w:pPr>
+      <w:r>
+        <w:rPr>
+          <w:color w:val="1F2937"/>
+          <w:sz w:val="22"/>
+          <w:szCs w:val="22"/>
+        </w:rPr>
+        <w:t xml:space="preserve">Relecture du 18/09/2026, chaque point rejoué sur le projet avant correction. Les corrections sont intégrées au texte ci-dessus avec un marqueur daté ; ce journal garde la formulation d'origine.</w:t>
+      </w:r>
+    </w:p>
+    <w:p>
+      <w:pPr>
+        <w:pStyle w:val="ListParagraph"/>
+        <w:numPr>
+          <w:ilvl w:val="0"/>
+          <w:numId w:val="1"/>
+        </w:numPr>
+        <w:spacing w:after="60" w:before="60" w:line="276" w:lineRule="auto"/>
+      </w:pPr>
+      <w:r>
+        <w:rPr>
+          <w:color w:val="1F2937"/>
+          <w:sz w:val="22"/>
+          <w:szCs w:val="22"/>
+        </w:rPr>
+        <w:t xml:space="preserve">« Trois fichiers sont en place » — quatre noms suivaient.</w:t>
+      </w:r>
+    </w:p>
+    <w:p>
+      <w:pPr>
+        <w:pStyle w:val="ListParagraph"/>
+        <w:numPr>
+          <w:ilvl w:val="0"/>
+          <w:numId w:val="1"/>
+        </w:numPr>
+        <w:spacing w:after="60" w:before="60" w:line="276" w:lineRule="auto"/>
+      </w:pPr>
+      <w:r>
+        <w:rPr>
+          <w:color w:val="1F2937"/>
+          <w:sz w:val="22"/>
+          <w:szCs w:val="22"/>
+        </w:rPr>
+        <w:t xml:space="preserve">« Repas les trois sections » (coquille).</w:t>
+      </w:r>
+    </w:p>
+    <w:p>
+      <w:pPr>
+        <w:pStyle w:val="ListParagraph"/>
+        <w:numPr>
+          <w:ilvl w:val="0"/>
+          <w:numId w:val="1"/>
+        </w:numPr>
+        <w:spacing w:after="60" w:before="60" w:line="276" w:lineRule="auto"/>
+      </w:pPr>
+      <w:r>
+        <w:rPr>
+          <w:color w:val="1F2937"/>
+          <w:sz w:val="22"/>
+          <w:szCs w:val="22"/>
+        </w:rPr>
+        <w:t xml:space="preserve">Extrait « comment serveur.js le consomme » : « const { RACINE, CATEGORIES, DOCS_DE_DOSSIER, … } » — serveur.js n'importe pas RACINE.</w:t>
+      </w:r>
+    </w:p>
+    <w:p>
+      <w:pPr>
+        <w:pStyle w:val="ListParagraph"/>
+        <w:numPr>
+          <w:ilvl w:val="0"/>
+          <w:numId w:val="1"/>
+        </w:numPr>
+        <w:spacing w:after="60" w:before="60" w:line="276" w:lineRule="auto"/>
+      </w:pPr>
+      <w:r>
+        <w:rPr>
+          <w:color w:val="1F2937"/>
+          <w:sz w:val="22"/>
+          <w:szCs w:val="22"/>
+        </w:rPr>
+        <w:t xml:space="preserve">Exercice 2 : « les fichiers sans aucune date … restent à NULL » — vrai pour 13 des 14, pas pour veille-essms-2026-05-20-2026-05-26.fiche.md.</w:t>
+      </w:r>
+    </w:p>
+    <w:p>
+      <w:pPr>
+        <w:pStyle w:val="ListParagraph"/>
+        <w:numPr>
+          <w:ilvl w:val="0"/>
+          <w:numId w:val="1"/>
+        </w:numPr>
+        <w:spacing w:after="60" w:before="60" w:line="276" w:lineRule="auto"/>
+      </w:pPr>
+      <w:r>
+        <w:rPr>
+          <w:color w:val="1F2937"/>
+          <w:sz w:val="22"/>
+          <w:szCs w:val="22"/>
+        </w:rPr>
+        <w:t xml:space="preserve">Exercice 3 : « La requête 2 … : vérifie que des quiz récents y apparaissent maintenant. » — impossible : cinq leçons des 17-18/09, dernier quiz le 27/06/2026.</w:t>
+      </w:r>
+    </w:p>
+    <w:p>
+      <w:pPr>
+        <w:pStyle w:val="ListParagraph"/>
+        <w:numPr>
+          <w:ilvl w:val="0"/>
+          <w:numId w:val="1"/>
+        </w:numPr>
+        <w:spacing w:after="60" w:before="60" w:line="276" w:lineRule="auto"/>
+      </w:pPr>
+      <w:r>
+        <w:rPr>
+          <w:color w:val="1F2937"/>
+          <w:sz w:val="22"/>
+          <w:szCs w:val="22"/>
+        </w:rPr>
+        <w:t xml:space="preserve">Encadré « Pourquoi les deux fichiers ne peuvent pas être le même ? » : « Un import relatif "../../src/types.ts" depuis le frontend franchirait une frontière que Vite ne résout pas à la compilation. » — tsc et vite build le résolvent ; seul le serveur dev refuse de servir hors server.fs.allow.</w:t>
+      </w:r>
+    </w:p>
+    <w:p>
+      <w:pPr>
+        <w:pStyle w:val="ListParagraph"/>
+        <w:numPr>
+          <w:ilvl w:val="0"/>
+          <w:numId w:val="1"/>
+        </w:numPr>
+        <w:spacing w:after="60" w:before="60" w:line="276" w:lineRule="auto"/>
+      </w:pPr>
+      <w:r>
+        <w:rPr>
+          <w:color w:val="1F2937"/>
+          <w:sz w:val="22"/>
+          <w:szCs w:val="22"/>
+        </w:rPr>
+        <w:t xml:space="preserve">Erreurs fréquentes, ligne « TypeError: db.prepare is not a function » : cause « better-sqlite3 attend un string SQL, pas plusieurs arguments », correction « Le .prepare() prend UN seul string. La concaténation doit être faite avant l'appel. » — mesuré : deux arguments ne lèvent rien ; le message vient d'un prepare() sur le module.</w:t>
       </w:r>
     </w:p>
     <w:sectPr>

</xml_diff>